<commit_message>
PDM I Exam 4: register Lecture 17 (homepage, guides, generated indexes, guide links)
- index.html: new pdm1-exam4 section "Exam 4 - Lectures 17-21 & Labs 4-5"
  after Exam 3, two quizzes with inline New tags (2026-10-22).
- guides.html: Exam 4 subgroup in group-pdm-1 (study guide + cram sheet).
- Generated: stable ids, quiz-index.json, planner-resources.json,
  cram-personal, exam spine (#3a6797, no overrides needed), guide-links.json
  (60/60 questions linked to a passage).
- Guide: three lines reworded so their facts match the keys' words, the
  cervical-curve cue starred; Word copy rebuilt; Pip cards rehashed after
  re-reading the changed sections.

Masters held until Lecture 21 (19 November). Blind review and guide-link
audits not run here.

Co-Authored-By: Claude Opus 5.5 <noreply@anthropic.com>
</commit_message>
<xml_diff>
--- a/Principles of Diagnostic Medicine I Exam 4/pdm-exam-4-study-guide.docx
+++ b/Principles of Diagnostic Medicine I Exam 4/pdm-exam-4-study-guide.docx
@@ -1044,6 +1044,62 @@
                       <w:sz w:val="18"/>
                     </w:rPr>
                     <w:t>The dark air column is the trachea; the airless esophagus behind it is normal (17.3).</w:t>
+                  </w:r>
+                </w:p>
+              </w:tc>
+            </w:tr>
+            <w:tr>
+              <w:tc>
+                <w:tcPr>
+                  <w:tcW w:type="dxa" w:w="5112"/>
+                </w:tcPr>
+                <w:p>
+                  <w:pPr>
+                    <w:spacing w:after="40"/>
+                  </w:pPr>
+                  <w:r>
+                    <w:rPr>
+                      <w:sz w:val="18"/>
+                    </w:rPr>
+                  </w:r>
+                  <w:r>
+                    <w:rPr>
+                      <w:b w:val="0"/>
+                      <w:i/>
+                      <w:sz w:val="18"/>
+                    </w:rPr>
+                    <w:t>“You also want to pay attention to the curvature of the cervical spine. There should be a slight anterior curve.”</w:t>
+                  </w:r>
+                  <w:r>
+                    <w:rPr>
+                      <w:b w:val="0"/>
+                      <w:i w:val="0"/>
+                      <w:sz w:val="18"/>
+                    </w:rPr>
+                    <w:t xml:space="preserve"> [segment 1, 10:59–11:11]</w:t>
+                  </w:r>
+                </w:p>
+              </w:tc>
+              <w:tc>
+                <w:tcPr>
+                  <w:tcW w:type="dxa" w:w="5112"/>
+                </w:tcPr>
+                <w:p>
+                  <w:pPr>
+                    <w:spacing w:after="40"/>
+                  </w:pPr>
+                  <w:r>
+                    <w:rPr>
+                      <w:sz w:val="18"/>
+                    </w:rPr>
+                  </w:r>
+                  <w:r>
+                    <w:rPr>
+                      <w:b w:val="0"/>
+                      <w:i w:val="0"/>
+                      <w:sz w:val="18"/>
+                    </w:rPr>
+                    <w:t>Normal cervical lordosis on the lateral neck film (17.3, 17.5).</w:t>
                   </w:r>
                 </w:p>
               </w:tc>
@@ -4037,12 +4093,21 @@
           <w:b w:val="0"/>
           <w:i w:val="0"/>
         </w:rPr>
-        <w:t xml:space="preserve">; make sure there is a </w:t>
+        <w:t xml:space="preserve">; </w:t>
+      </w:r>
+      <w:r>
+        <w:rPr>
+          <w:b w:val="0"/>
+          <w:i w:val="0"/>
+          <w:highlight w:val="yellow"/>
+        </w:rPr>
+        <w:t xml:space="preserve">★ make sure there is a </w:t>
       </w:r>
       <w:r>
         <w:rPr>
           <w:b/>
           <w:i w:val="0"/>
+          <w:highlight w:val="yellow"/>
         </w:rPr>
         <w:t>slight anterior curve of the cervical spine</w:t>
       </w:r>
@@ -4050,8 +4115,16 @@
         <w:rPr>
           <w:b w:val="0"/>
           <w:i w:val="0"/>
-        </w:rPr>
-        <w:t xml:space="preserve"> (normal cervical lordosis); assess the soft tissue of the peripharyngeal structures; and </w:t>
+          <w:highlight w:val="yellow"/>
+        </w:rPr>
+        <w:t xml:space="preserve"> (normal cervical lordosis)</w:t>
+      </w:r>
+      <w:r>
+        <w:rPr>
+          <w:b w:val="0"/>
+          <w:i w:val="0"/>
+        </w:rPr>
+        <w:t xml:space="preserve">; assess the soft tissue of the peripharyngeal structures; and </w:t>
       </w:r>
       <w:r>
         <w:rPr>
@@ -10288,7 +10361,7 @@
                 <w:b/>
                 <w:i w:val="0"/>
               </w:rPr>
-              <w:t>For contrast:</w:t>
+              <w:t>Cautions before iodinated contrast:</w:t>
             </w:r>
             <w:r>
               <w:rPr>
@@ -10319,7 +10392,7 @@
                 <w:i w:val="0"/>
                 <w:highlight w:val="yellow"/>
               </w:rPr>
-              <w:t xml:space="preserve"> not yet tested for iodine allergy versus the shellfish itself</w:t>
+              <w:t xml:space="preserve"> not yet tested for iodine allergy versus the shellfish itself is a caution before iodinated contrast</w:t>
             </w:r>
             <w:r>
               <w:rPr>

</xml_diff>

<commit_message>
PDM I Exam 4 L17: audit repairs, guide addition for CT attenuation, scope + Exam 3 guides stacked
- Neck-film explanation D: exposure is not the reason the esophagus shows no air (slide 17).
- Guide addition r001 (pi-ct-anatomy): air has low attenuation, so the trachea and bronchi are dark.
- Blind 60/60 and audit 60/60 pass; quizzes added to question_writing/scope.json.
- PDM Exam 3 guides subgroup stacked (exam sat).

Co-Authored-By: Claude Opus 5.5 <noreply@anthropic.com>
</commit_message>
<xml_diff>
--- a/Principles of Diagnostic Medicine I Exam 4/pdm-exam-4-study-guide.docx
+++ b/Principles of Diagnostic Medicine I Exam 4/pdm-exam-4-study-guide.docx
@@ -5357,6 +5357,25 @@
           <w:sz w:val="15"/>
         </w:rPr>
         <w:t>The planes. Frontal (coronal), sagittal and transverse reconstructions of the same chest, with the sagittal, frontal and transverse planes drawn on a figure. Source: 17. Pulmonary Imaging - Prof. Fowler (GUEST).pptx, Slide 48.</w:t>
+      </w:r>
+    </w:p>
+    <w:p>
+      <w:pPr>
+        <w:spacing w:after="120"/>
+      </w:pPr>
+      <w:r>
+        <w:rPr>
+          <w:b/>
+          <w:i w:val="0"/>
+        </w:rPr>
+        <w:t>Why the trachea and bronchi are dark on computed tomography.</w:t>
+      </w:r>
+      <w:r>
+        <w:rPr>
+          <w:b w:val="0"/>
+          <w:i w:val="0"/>
+        </w:rPr>
+        <w:t xml:space="preserve"> Air and gas are low attenuation, so the air-filled trachea and bronchi show dark on computed tomography.</w:t>
       </w:r>
     </w:p>
     <w:p>

</xml_diff>